<commit_message>
Add controlled synthetic experiment section to IEEE paper
New Section VIII and Table III report 5-seed synthetic ROC-AUC for three
planted-structure settings, labelled as designed experiments that do not
change the real-data results. Abstract and conclusion updated; later
sections renumbered. Still 3 pages.

Co-Authored-By: Claude Opus 5.5 <noreply@anthropic.com>
Claude-Session: https://claude.ai/code/session_017ahbmrtiWEah6tD78ihnA6
</commit_message>
<xml_diff>
--- a/reports/crm/final/deliverables/CRM_IEEE_Paper.docx
+++ b/reports/crm/final/deliverables/CRM_IEEE_Paper.docx
@@ -77,7 +77,7 @@
           <w:b/>
           <w:sz w:val="18"/>
         </w:rPr>
-        <w:t>We build a reproducible pipeline that estimates the probability that a CRM sales opportunity is Won or Lost and reports the input factors behind each score. We compare Logistic Regression (LR), Random Forest (RF), a multilayer perceptron (MLP) and TabNet against a prior-only control on the Maven CRM Sales Opportunities data, using a time-ordered split that excludes deals whose outcome was not yet known. LR is selected on validation ROC-AUC and reaches a test ROC-AUC of only 0.524, close to chance; no model beats the control in any practical sense. A deliberately invalid control that uses close value reaches AUC 1.0, showing how leakage produces misleading scores. Our contribution is an auditable, explainable evaluation workflow and an honest negative finding, not a new algorithm.</w:t>
+        <w:t>We build a reproducible pipeline that estimates the probability that a CRM sales opportunity is Won or Lost and reports the input factors behind each score. We compare Logistic Regression (LR), Random Forest (RF), a multilayer perceptron (MLP) and TabNet against a prior-only control on the Maven CRM Sales Opportunities data, using a time-ordered split that excludes deals whose outcome was not yet known. LR is selected on validation ROC-AUC and reaches a test ROC-AUC of only 0.524, close to chance; no model beats the control in any practical sense. A deliberately invalid control that uses close value reaches AUC 1.0, showing how leakage produces misleading scores. Our contribution is an auditable, explainable evaluation workflow and an honest negative finding, not a new algorithm. A controlled synthetic experiment with known win probabilities shows TabNet outperforming Random Forest only when outcomes depend smoothly on continuous deal signals.</w:t>
       </w:r>
     </w:p>
     <w:p>
@@ -2209,7 +2209,565 @@
           <w:i w:val="0"/>
           <w:sz w:val="19"/>
         </w:rPr>
-        <w:t>VIII. LIMITATIONS</w:t>
+        <w:t>VIII. CONTROLLED SYNTHETIC EXPERIMENT</w:t>
+      </w:r>
+    </w:p>
+    <w:p>
+      <w:pPr>
+        <w:jc w:val="both"/>
+      </w:pPr>
+      <w:r>
+        <w:rPr>
+          <w:b w:val="0"/>
+          <w:i w:val="0"/>
+        </w:rPr>
+        <w:t xml:space="preserve">Because the real data carry little signal, we also ask when the more complex models can help, using synthetic deals whose true win probability is known. A generator reuses the real accounts, agents, products and calendar, adds nine products, competitor attributes and five-year industry trends, and draws each outcome from a planted logistic model. The outcome mechanism is our own design, not an estimate of real sales behavior. Each setting has 100,000 deals and uses the same as-of split, preprocessing and model settings as Section VI, with the synthetic comparison and trend fields added as features, and is repeated over five data seeds.</w:t>
+      </w:r>
+    </w:p>
+    <w:p>
+      <w:pPr>
+        <w:jc w:val="both"/>
+      </w:pPr>
+      <w:r>
+        <w:rPr>
+          <w:b w:val="0"/>
+          <w:i w:val="0"/>
+        </w:rPr>
+        <w:t xml:space="preserve">We vary the planted structure: (a) mostly additive effects with weak interactions; (b) the same with step-like interactions tripled; (c) weak interactions plus four continuous per-deal signals (discount, quote gap, engagement, contact recency) that act through a smooth tanh of their linear combination. Setting (c) was chosen deliberately because it favors neural models.</w:t>
+      </w:r>
+    </w:p>
+    <w:p>
+      <w:pPr>
+        <w:keepNext/>
+        <w:spacing w:after="40"/>
+        <w:jc w:val="center"/>
+      </w:pPr>
+      <w:r>
+        <w:rPr>
+          <w:b w:val="0"/>
+          <w:i w:val="0"/>
+          <w:sz w:val="16"/>
+        </w:rPr>
+        <w:t>TABLE III. Synthetic test ROC-AUC, mean ± s.d. over five seeds.</w:t>
+      </w:r>
+    </w:p>
+    <w:tbl>
+      <w:tblPr>
+        <w:tblStyle w:val="TableGrid"/>
+        <w:tblW w:type="auto" w:w="0"/>
+        <w:jc w:val="center"/>
+        <w:tblLayout w:type="fixed"/>
+        <w:tblLook w:firstColumn="1" w:firstRow="1" w:lastColumn="0" w:lastRow="0" w:noHBand="0" w:noVBand="1" w:val="04A0"/>
+      </w:tblPr>
+      <w:tblGrid>
+        <w:gridCol w:w="1368"/>
+        <w:gridCol w:w="1200"/>
+        <w:gridCol w:w="1200"/>
+        <w:gridCol w:w="1200"/>
+      </w:tblGrid>
+      <w:tr>
+        <w:tc>
+          <w:tcPr>
+            <w:tcW w:type="dxa" w:w="1368"/>
+            <w:shd w:val="clear" w:fill="E6E6E6"/>
+          </w:tcPr>
+          <w:p>
+            <w:pPr>
+              <w:keepNext/>
+              <w:spacing w:after="0"/>
+              <w:jc w:val="left"/>
+            </w:pPr>
+            <w:r>
+              <w:rPr>
+                <w:b/>
+                <w:sz w:val="15"/>
+              </w:rPr>
+              <w:t>Model</w:t>
+            </w:r>
+          </w:p>
+        </w:tc>
+        <w:tc>
+          <w:tcPr>
+            <w:tcW w:type="dxa" w:w="1200"/>
+            <w:shd w:val="clear" w:fill="E6E6E6"/>
+          </w:tcPr>
+          <w:p>
+            <w:pPr>
+              <w:keepNext/>
+              <w:spacing w:after="0"/>
+              <w:jc w:val="center"/>
+            </w:pPr>
+            <w:r>
+              <w:rPr>
+                <w:b/>
+                <w:sz w:val="15"/>
+              </w:rPr>
+              <w:t>(a) Weak</w:t>
+            </w:r>
+          </w:p>
+        </w:tc>
+        <w:tc>
+          <w:tcPr>
+            <w:tcW w:type="dxa" w:w="1200"/>
+            <w:shd w:val="clear" w:fill="E6E6E6"/>
+          </w:tcPr>
+          <w:p>
+            <w:pPr>
+              <w:keepNext/>
+              <w:spacing w:after="0"/>
+              <w:jc w:val="center"/>
+            </w:pPr>
+            <w:r>
+              <w:rPr>
+                <w:b/>
+                <w:sz w:val="15"/>
+              </w:rPr>
+              <w:t>(b) Step-like</w:t>
+            </w:r>
+          </w:p>
+        </w:tc>
+        <w:tc>
+          <w:tcPr>
+            <w:tcW w:type="dxa" w:w="1200"/>
+            <w:shd w:val="clear" w:fill="E6E6E6"/>
+          </w:tcPr>
+          <w:p>
+            <w:pPr>
+              <w:keepNext/>
+              <w:spacing w:after="0"/>
+              <w:jc w:val="center"/>
+            </w:pPr>
+            <w:r>
+              <w:rPr>
+                <w:b/>
+                <w:sz w:val="15"/>
+              </w:rPr>
+              <w:t>(c) Smooth</w:t>
+            </w:r>
+          </w:p>
+        </w:tc>
+      </w:tr>
+      <w:tr>
+        <w:tc>
+          <w:tcPr>
+            <w:tcW w:type="dxa" w:w="1368"/>
+          </w:tcPr>
+          <w:p>
+            <w:pPr>
+              <w:keepNext/>
+              <w:spacing w:after="0"/>
+              <w:jc w:val="left"/>
+            </w:pPr>
+            <w:r>
+              <w:rPr>
+                <w:b w:val="0"/>
+                <w:sz w:val="15"/>
+              </w:rPr>
+              <w:t>Logistic Reg.</w:t>
+            </w:r>
+          </w:p>
+        </w:tc>
+        <w:tc>
+          <w:tcPr>
+            <w:tcW w:type="dxa" w:w="1200"/>
+          </w:tcPr>
+          <w:p>
+            <w:pPr>
+              <w:keepNext/>
+              <w:spacing w:after="0"/>
+              <w:jc w:val="center"/>
+            </w:pPr>
+            <w:r>
+              <w:rPr>
+                <w:b w:val="0"/>
+                <w:sz w:val="15"/>
+              </w:rPr>
+              <w:t>0.761 ± 0.012</w:t>
+            </w:r>
+          </w:p>
+        </w:tc>
+        <w:tc>
+          <w:tcPr>
+            <w:tcW w:type="dxa" w:w="1200"/>
+          </w:tcPr>
+          <w:p>
+            <w:pPr>
+              <w:keepNext/>
+              <w:spacing w:after="0"/>
+              <w:jc w:val="center"/>
+            </w:pPr>
+            <w:r>
+              <w:rPr>
+                <w:b w:val="0"/>
+                <w:sz w:val="15"/>
+              </w:rPr>
+              <w:t>0.827 ± 0.008</w:t>
+            </w:r>
+          </w:p>
+        </w:tc>
+        <w:tc>
+          <w:tcPr>
+            <w:tcW w:type="dxa" w:w="1200"/>
+          </w:tcPr>
+          <w:p>
+            <w:pPr>
+              <w:keepNext/>
+              <w:spacing w:after="0"/>
+              <w:jc w:val="center"/>
+            </w:pPr>
+            <w:r>
+              <w:rPr>
+                <w:b w:val="0"/>
+                <w:sz w:val="15"/>
+              </w:rPr>
+              <w:t>0.833 ± 0.003</w:t>
+            </w:r>
+          </w:p>
+        </w:tc>
+      </w:tr>
+      <w:tr>
+        <w:tc>
+          <w:tcPr>
+            <w:tcW w:type="dxa" w:w="1368"/>
+          </w:tcPr>
+          <w:p>
+            <w:pPr>
+              <w:keepNext/>
+              <w:spacing w:after="0"/>
+              <w:jc w:val="left"/>
+            </w:pPr>
+            <w:r>
+              <w:rPr>
+                <w:b w:val="0"/>
+                <w:sz w:val="15"/>
+              </w:rPr>
+              <w:t>Random Forest</w:t>
+            </w:r>
+          </w:p>
+        </w:tc>
+        <w:tc>
+          <w:tcPr>
+            <w:tcW w:type="dxa" w:w="1200"/>
+          </w:tcPr>
+          <w:p>
+            <w:pPr>
+              <w:keepNext/>
+              <w:spacing w:after="0"/>
+              <w:jc w:val="center"/>
+            </w:pPr>
+            <w:r>
+              <w:rPr>
+                <w:b w:val="0"/>
+                <w:sz w:val="15"/>
+              </w:rPr>
+              <w:t>0.758 ± 0.012</w:t>
+            </w:r>
+          </w:p>
+        </w:tc>
+        <w:tc>
+          <w:tcPr>
+            <w:tcW w:type="dxa" w:w="1200"/>
+          </w:tcPr>
+          <w:p>
+            <w:pPr>
+              <w:keepNext/>
+              <w:spacing w:after="0"/>
+              <w:jc w:val="center"/>
+            </w:pPr>
+            <w:r>
+              <w:rPr>
+                <w:b w:val="0"/>
+                <w:sz w:val="15"/>
+              </w:rPr>
+              <w:t>0.872 ± 0.007</w:t>
+            </w:r>
+          </w:p>
+        </w:tc>
+        <w:tc>
+          <w:tcPr>
+            <w:tcW w:type="dxa" w:w="1200"/>
+          </w:tcPr>
+          <w:p>
+            <w:pPr>
+              <w:keepNext/>
+              <w:spacing w:after="0"/>
+              <w:jc w:val="center"/>
+            </w:pPr>
+            <w:r>
+              <w:rPr>
+                <w:b w:val="0"/>
+                <w:sz w:val="15"/>
+              </w:rPr>
+              <w:t>0.846 ± 0.002</w:t>
+            </w:r>
+          </w:p>
+        </w:tc>
+      </w:tr>
+      <w:tr>
+        <w:tc>
+          <w:tcPr>
+            <w:tcW w:type="dxa" w:w="1368"/>
+          </w:tcPr>
+          <w:p>
+            <w:pPr>
+              <w:keepNext/>
+              <w:spacing w:after="0"/>
+              <w:jc w:val="left"/>
+            </w:pPr>
+            <w:r>
+              <w:rPr>
+                <w:b w:val="0"/>
+                <w:sz w:val="15"/>
+              </w:rPr>
+              <w:t>MLP</w:t>
+            </w:r>
+          </w:p>
+        </w:tc>
+        <w:tc>
+          <w:tcPr>
+            <w:tcW w:type="dxa" w:w="1200"/>
+          </w:tcPr>
+          <w:p>
+            <w:pPr>
+              <w:keepNext/>
+              <w:spacing w:after="0"/>
+              <w:jc w:val="center"/>
+            </w:pPr>
+            <w:r>
+              <w:rPr>
+                <w:b w:val="0"/>
+                <w:sz w:val="15"/>
+              </w:rPr>
+              <w:t>0.766 ± 0.011</w:t>
+            </w:r>
+          </w:p>
+        </w:tc>
+        <w:tc>
+          <w:tcPr>
+            <w:tcW w:type="dxa" w:w="1200"/>
+          </w:tcPr>
+          <w:p>
+            <w:pPr>
+              <w:keepNext/>
+              <w:spacing w:after="0"/>
+              <w:jc w:val="center"/>
+            </w:pPr>
+            <w:r>
+              <w:rPr>
+                <w:b w:val="0"/>
+                <w:sz w:val="15"/>
+              </w:rPr>
+              <w:t>0.873 ± 0.008</w:t>
+            </w:r>
+          </w:p>
+        </w:tc>
+        <w:tc>
+          <w:tcPr>
+            <w:tcW w:type="dxa" w:w="1200"/>
+          </w:tcPr>
+          <w:p>
+            <w:pPr>
+              <w:keepNext/>
+              <w:spacing w:after="0"/>
+              <w:jc w:val="center"/>
+            </w:pPr>
+            <w:r>
+              <w:rPr>
+                <w:b w:val="0"/>
+                <w:sz w:val="15"/>
+              </w:rPr>
+              <w:t>0.866 ± 0.004</w:t>
+            </w:r>
+          </w:p>
+        </w:tc>
+      </w:tr>
+      <w:tr>
+        <w:tc>
+          <w:tcPr>
+            <w:tcW w:type="dxa" w:w="1368"/>
+          </w:tcPr>
+          <w:p>
+            <w:pPr>
+              <w:keepNext/>
+              <w:spacing w:after="0"/>
+              <w:jc w:val="left"/>
+            </w:pPr>
+            <w:r>
+              <w:rPr>
+                <w:b w:val="0"/>
+                <w:sz w:val="15"/>
+              </w:rPr>
+              <w:t>TabNet</w:t>
+            </w:r>
+          </w:p>
+        </w:tc>
+        <w:tc>
+          <w:tcPr>
+            <w:tcW w:type="dxa" w:w="1200"/>
+          </w:tcPr>
+          <w:p>
+            <w:pPr>
+              <w:keepNext/>
+              <w:spacing w:after="0"/>
+              <w:jc w:val="center"/>
+            </w:pPr>
+            <w:r>
+              <w:rPr>
+                <w:b w:val="0"/>
+                <w:sz w:val="15"/>
+              </w:rPr>
+              <w:t>0.765 ± 0.013</w:t>
+            </w:r>
+          </w:p>
+        </w:tc>
+        <w:tc>
+          <w:tcPr>
+            <w:tcW w:type="dxa" w:w="1200"/>
+          </w:tcPr>
+          <w:p>
+            <w:pPr>
+              <w:keepNext/>
+              <w:spacing w:after="0"/>
+              <w:jc w:val="center"/>
+            </w:pPr>
+            <w:r>
+              <w:rPr>
+                <w:b w:val="0"/>
+                <w:sz w:val="15"/>
+              </w:rPr>
+              <w:t>0.875 ± 0.008</w:t>
+            </w:r>
+          </w:p>
+        </w:tc>
+        <w:tc>
+          <w:tcPr>
+            <w:tcW w:type="dxa" w:w="1200"/>
+          </w:tcPr>
+          <w:p>
+            <w:pPr>
+              <w:keepNext/>
+              <w:spacing w:after="0"/>
+              <w:jc w:val="center"/>
+            </w:pPr>
+            <w:r>
+              <w:rPr>
+                <w:b w:val="0"/>
+                <w:sz w:val="15"/>
+              </w:rPr>
+              <w:t>0.868 ± 0.001</w:t>
+            </w:r>
+          </w:p>
+        </w:tc>
+      </w:tr>
+      <w:tr>
+        <w:tc>
+          <w:tcPr>
+            <w:tcW w:type="dxa" w:w="1368"/>
+          </w:tcPr>
+          <w:p>
+            <w:pPr>
+              <w:keepNext/>
+              <w:spacing w:after="0"/>
+              <w:jc w:val="left"/>
+            </w:pPr>
+            <w:r>
+              <w:rPr>
+                <w:b w:val="0"/>
+                <w:sz w:val="15"/>
+              </w:rPr>
+              <w:t>Oracle (true p)</w:t>
+            </w:r>
+          </w:p>
+        </w:tc>
+        <w:tc>
+          <w:tcPr>
+            <w:tcW w:type="dxa" w:w="1200"/>
+          </w:tcPr>
+          <w:p>
+            <w:pPr>
+              <w:keepNext/>
+              <w:spacing w:after="0"/>
+              <w:jc w:val="center"/>
+            </w:pPr>
+            <w:r>
+              <w:rPr>
+                <w:b w:val="0"/>
+                <w:sz w:val="15"/>
+              </w:rPr>
+              <w:t>0.779</w:t>
+            </w:r>
+          </w:p>
+        </w:tc>
+        <w:tc>
+          <w:tcPr>
+            <w:tcW w:type="dxa" w:w="1200"/>
+          </w:tcPr>
+          <w:p>
+            <w:pPr>
+              <w:keepNext/>
+              <w:spacing w:after="0"/>
+              <w:jc w:val="center"/>
+            </w:pPr>
+            <w:r>
+              <w:rPr>
+                <w:b w:val="0"/>
+                <w:sz w:val="15"/>
+              </w:rPr>
+              <w:t>0.886</w:t>
+            </w:r>
+          </w:p>
+        </w:tc>
+        <w:tc>
+          <w:tcPr>
+            <w:tcW w:type="dxa" w:w="1200"/>
+          </w:tcPr>
+          <w:p>
+            <w:pPr>
+              <w:keepNext/>
+              <w:spacing w:after="0"/>
+              <w:jc w:val="center"/>
+            </w:pPr>
+            <w:r>
+              <w:rPr>
+                <w:b w:val="0"/>
+                <w:sz w:val="15"/>
+              </w:rPr>
+              <w:t>0.881</w:t>
+            </w:r>
+          </w:p>
+        </w:tc>
+      </w:tr>
+    </w:tbl>
+    <w:p>
+      <w:pPr>
+        <w:spacing w:after="0"/>
+      </w:pPr>
+    </w:p>
+    <w:p>
+      <w:pPr>
+        <w:jc w:val="both"/>
+      </w:pPr>
+      <w:r>
+        <w:rPr>
+          <w:b w:val="0"/>
+          <w:i w:val="0"/>
+        </w:rPr>
+        <w:t xml:space="preserve">With weak interactions all models lie within 0.01 AUC. Step-like interactions open a gap to LR (TabNet +0.048 in every seed) but leave RF, MLP and TabNet within 0.003. With smooth continuous signals TabNet beats RF by 0.021 AUC (range 0.019 to 0.024, all five seeds) and ties the MLP. TabNet’s advantage over trees thus appears only when outcomes depend smoothly on continuous features and data are plentiful, conditions absent from the real CRM data with its 2,975 training deals and mostly categorical inputs. These results illustrate model behavior; they are not evidence about real opportunities and do not change Section VI.</w:t>
+      </w:r>
+    </w:p>
+    <w:p>
+      <w:pPr>
+        <w:keepNext/>
+        <w:spacing w:after="40" w:before="100"/>
+        <w:jc w:val="center"/>
+      </w:pPr>
+      <w:r>
+        <w:rPr>
+          <w:b/>
+          <w:i w:val="0"/>
+          <w:sz w:val="19"/>
+        </w:rPr>
+        <w:t>IX. LIMITATIONS</w:t>
       </w:r>
     </w:p>
     <w:p>
@@ -2236,7 +2794,7 @@
           <w:i w:val="0"/>
           <w:sz w:val="19"/>
         </w:rPr>
-        <w:t>IX. CONCLUSION</w:t>
+        <w:t>X. CONCLUSION</w:t>
       </w:r>
     </w:p>
     <w:p>
@@ -2248,7 +2806,7 @@
           <w:b w:val="0"/>
           <w:i w:val="0"/>
         </w:rPr>
-        <w:t>We implemented the four required classifiers and a prior control on a leakage-aware temporal split, with calibrated probabilities and explanations. Under this protocol no model discriminates meaningfully (best test AUC 0.524), and complex models, including TabNet, do not help. We report this negative result openly rather than use post-outcome information. Future work includes multiple temporal windows, account-grouped evaluation, richer pre-close activity features, separate calibration data and prospective testing of any priority policy.</w:t>
+        <w:t>We implemented the four required classifiers and a prior control on a leakage-aware temporal split, with calibrated probabilities and explanations. Under this protocol no model discriminates meaningfully (best test AUC 0.524), and complex models, including TabNet, do not help. We report this negative result openly rather than use post-outcome information. Synthetic experiments suggest TabNet beats trees only with smooth continuous signals and ample data. Future work includes multiple temporal windows, account-grouped evaluation, richer pre-close activity features, separate calibration data and prospective testing of any priority policy.</w:t>
       </w:r>
     </w:p>
     <w:p>

</xml_diff>